<commit_message>
Horizon #1206/#1207: no-wrap dates/times/amounts (Norbert 7091)
Co-Authored-By: Claude Opus 5.5 (1M context) <noreply@anthropic.com>
</commit_message>
<xml_diff>
--- a/payments/2026-09/# 1206 - Receipt Horizon Entertainment (September 26).docx
+++ b/payments/2026-09/# 1206 - Receipt Horizon Entertainment (September 26).docx
@@ -1357,7 +1357,7 @@
                 <w:sz w:val="16"/>
                 <w:szCs w:val="16"/>
               </w:rPr>
-              <w:t>01.09.2026 - 30.09.2026</w:t>
+              <w:t>01.09.2026 - 30.09.2026</w:t>
             </w:r>
             <w:r>
               <w:rPr>
@@ -1480,7 +1480,7 @@
                 <w:szCs w:val="16"/>
                 <w:lang w:bidi="ar-SA"/>
               </w:rPr>
-              <w:t>18:30 - 22:30</w:t>
+              <w:t>18:30 - 22:30</w:t>
             </w:r>
           </w:p>
         </w:tc>
@@ -1514,7 +1514,7 @@
                 <w:sz w:val="16"/>
                 <w:szCs w:val="16"/>
               </w:rPr>
-              <w:t>113,400.00 THB</w:t>
+              <w:t>113,400.00 THB</w:t>
             </w:r>
             <w:r>
               <w:rPr>
@@ -1588,7 +1588,7 @@
                 <w:sz w:val="16"/>
                 <w:szCs w:val="16"/>
               </w:rPr>
-              <w:t>113,400.00 THB</w:t>
+              <w:t>113,400.00 THB</w:t>
             </w:r>
             <w:r>
               <w:rPr>
@@ -1885,7 +1885,7 @@
                 <w:sz w:val="16"/>
                 <w:szCs w:val="16"/>
               </w:rPr>
-              <w:t>-7,560.00 THB</w:t>
+              <w:t>-7,560.00 THB</w:t>
             </w:r>
             <w:r>
               <w:rPr>
@@ -1959,7 +1959,7 @@
                 <w:sz w:val="16"/>
                 <w:szCs w:val="16"/>
               </w:rPr>
-              <w:t>-7,560.00 THB</w:t>
+              <w:t>-7,560.00 THB</w:t>
             </w:r>
             <w:r>
               <w:rPr>
@@ -2161,7 +2161,7 @@
                 <w:sz w:val="16"/>
                 <w:szCs w:val="16"/>
               </w:rPr>
-              <w:t>105,840.00 THB</w:t>
+              <w:t>105,840.00 THB</w:t>
             </w:r>
             <w:r>
               <w:rPr>
@@ -2362,7 +2362,7 @@
                 <w:sz w:val="16"/>
                 <w:szCs w:val="16"/>
               </w:rPr>
-              <w:t>7,408.80 THB</w:t>
+              <w:t>7,408.80 THB</w:t>
             </w:r>
             <w:r>
               <w:rPr>
@@ -2565,7 +2565,7 @@
                 <w:sz w:val="16"/>
                 <w:szCs w:val="16"/>
               </w:rPr>
-              <w:t>113,248.80 THB</w:t>
+              <w:t>113,248.80 THB</w:t>
             </w:r>
             <w:r>
               <w:rPr>

</xml_diff>

<commit_message>
Horizon #1206/#1207 docx: restore DATE line from 1205 template (Norbert 7099)
Co-Authored-By: Claude Opus 5.5 (1M context) <noreply@anthropic.com>
</commit_message>
<xml_diff>
--- a/payments/2026-09/# 1206 - Receipt Horizon Entertainment (September 26).docx
+++ b/payments/2026-09/# 1206 - Receipt Horizon Entertainment (September 26).docx
@@ -426,14 +426,7 @@
           <w:sz w:val="20"/>
           <w:szCs w:val="20"/>
         </w:rPr>
-        <w:t>Email: office@brightears.com</w:t>
-        <w:tab/>
-        <w:tab/>
-        <w:tab/>
-        <w:tab/>
-        <w:tab/>
-        <w:tab/>
-        <w:t>DATE: 28.10.2026</w:t>
+        <w:t xml:space="preserve">Email: </w:t>
       </w:r>
       <w:hyperlink r:id="rId7" w:history="1">
         <w:r>
@@ -452,41 +445,47 @@
           <w:sz w:val="20"/>
           <w:szCs w:val="20"/>
         </w:rPr>
-      </w:r>
-      <w:r>
-        <w:rPr>
-          <w:rFonts w:ascii="Arial" w:hAnsi="Arial" w:cs="Tahoma"/>
-          <w:sz w:val="20"/>
-          <w:szCs w:val="20"/>
-        </w:rPr>
-      </w:r>
-      <w:r>
-        <w:rPr>
-          <w:rFonts w:ascii="Arial" w:hAnsi="Arial" w:cs="Tahoma"/>
-          <w:sz w:val="20"/>
-          <w:szCs w:val="20"/>
-        </w:rPr>
-      </w:r>
-      <w:r>
-        <w:rPr>
-          <w:rFonts w:ascii="Arial" w:hAnsi="Arial" w:cs="Tahoma"/>
-          <w:sz w:val="20"/>
-          <w:szCs w:val="20"/>
-        </w:rPr>
-      </w:r>
-      <w:r>
-        <w:rPr>
-          <w:rFonts w:ascii="Arial" w:hAnsi="Arial" w:cs="Tahoma"/>
-          <w:sz w:val="20"/>
-          <w:szCs w:val="20"/>
-        </w:rPr>
-      </w:r>
-      <w:r>
-        <w:rPr>
-          <w:rFonts w:ascii="Arial" w:hAnsi="Arial" w:cs="Tahoma"/>
-          <w:sz w:val="20"/>
-          <w:szCs w:val="20"/>
-        </w:rPr>
+        <w:tab/>
+      </w:r>
+      <w:r>
+        <w:rPr>
+          <w:rFonts w:ascii="Arial" w:hAnsi="Arial" w:cs="Tahoma"/>
+          <w:sz w:val="20"/>
+          <w:szCs w:val="20"/>
+        </w:rPr>
+        <w:tab/>
+      </w:r>
+      <w:r>
+        <w:rPr>
+          <w:rFonts w:ascii="Arial" w:hAnsi="Arial" w:cs="Tahoma"/>
+          <w:sz w:val="20"/>
+          <w:szCs w:val="20"/>
+        </w:rPr>
+        <w:tab/>
+      </w:r>
+      <w:r>
+        <w:rPr>
+          <w:rFonts w:ascii="Arial" w:hAnsi="Arial" w:cs="Tahoma"/>
+          <w:sz w:val="20"/>
+          <w:szCs w:val="20"/>
+        </w:rPr>
+        <w:tab/>
+      </w:r>
+      <w:r>
+        <w:rPr>
+          <w:rFonts w:ascii="Arial" w:hAnsi="Arial" w:cs="Tahoma"/>
+          <w:sz w:val="20"/>
+          <w:szCs w:val="20"/>
+        </w:rPr>
+        <w:tab/>
+      </w:r>
+      <w:r>
+        <w:rPr>
+          <w:rFonts w:ascii="Arial" w:hAnsi="Arial" w:cs="Tahoma"/>
+          <w:sz w:val="20"/>
+          <w:szCs w:val="20"/>
+        </w:rPr>
+        <w:tab/>
       </w:r>
       <w:r>
         <w:rPr>
@@ -496,6 +495,7 @@
           <w:sz w:val="20"/>
           <w:szCs w:val="20"/>
         </w:rPr>
+        <w:t>DATE</w:t>
       </w:r>
       <w:r>
         <w:rPr>
@@ -505,62 +505,71 @@
           <w:sz w:val="20"/>
           <w:szCs w:val="20"/>
         </w:rPr>
-      </w:r>
-      <w:r>
-        <w:rPr>
-          <w:rFonts w:ascii="Arial" w:hAnsi="Arial" w:cs="Tahoma"/>
-          <w:sz w:val="20"/>
-          <w:szCs w:val="20"/>
-        </w:rPr>
-      </w:r>
-      <w:r>
-        <w:rPr>
-          <w:rFonts w:ascii="Arial" w:hAnsi="Arial" w:cs="Tahoma"/>
-          <w:sz w:val="20"/>
-          <w:szCs w:val="20"/>
-        </w:rPr>
-      </w:r>
-      <w:r>
-        <w:rPr>
-          <w:rFonts w:ascii="Arial" w:hAnsi="Arial" w:cs="Tahoma"/>
-          <w:sz w:val="20"/>
-          <w:szCs w:val="20"/>
-        </w:rPr>
-      </w:r>
-      <w:r>
-        <w:rPr>
-          <w:rFonts w:ascii="Arial" w:hAnsi="Arial" w:cs="Tahoma"/>
-          <w:sz w:val="20"/>
-          <w:szCs w:val="20"/>
-        </w:rPr>
-      </w:r>
-      <w:r>
-        <w:rPr>
-          <w:rFonts w:ascii="Arial" w:hAnsi="Arial" w:cs="Tahoma"/>
-          <w:sz w:val="20"/>
-          <w:szCs w:val="20"/>
-        </w:rPr>
-      </w:r>
-      <w:r>
-        <w:rPr>
-          <w:rFonts w:ascii="Arial" w:hAnsi="Arial" w:cs="Tahoma"/>
-          <w:sz w:val="20"/>
-          <w:szCs w:val="20"/>
-        </w:rPr>
-      </w:r>
-      <w:r>
-        <w:rPr>
-          <w:rFonts w:ascii="Arial" w:hAnsi="Arial" w:cs="Tahoma"/>
-          <w:sz w:val="20"/>
-          <w:szCs w:val="20"/>
-        </w:rPr>
-      </w:r>
-      <w:r>
-        <w:rPr>
-          <w:rFonts w:ascii="Arial" w:hAnsi="Arial" w:cs="Tahoma"/>
-          <w:sz w:val="20"/>
-          <w:szCs w:val="20"/>
-        </w:rPr>
+        <w:t xml:space="preserve">: </w:t>
+      </w:r>
+      <w:r>
+        <w:rPr>
+          <w:rFonts w:ascii="Arial" w:hAnsi="Arial" w:cs="Tahoma"/>
+          <w:sz w:val="20"/>
+          <w:szCs w:val="20"/>
+        </w:rPr>
+        <w:t>28.10.2026</w:t>
+      </w:r>
+      <w:r>
+        <w:rPr>
+          <w:rFonts w:ascii="Arial" w:hAnsi="Arial" w:cs="Tahoma"/>
+          <w:sz w:val="20"/>
+          <w:szCs w:val="20"/>
+        </w:rPr>
+        <w:t/>
+      </w:r>
+      <w:r>
+        <w:rPr>
+          <w:rFonts w:ascii="Arial" w:hAnsi="Arial" w:cs="Tahoma"/>
+          <w:sz w:val="20"/>
+          <w:szCs w:val="20"/>
+        </w:rPr>
+        <w:t/>
+      </w:r>
+      <w:r>
+        <w:rPr>
+          <w:rFonts w:ascii="Arial" w:hAnsi="Arial" w:cs="Tahoma"/>
+          <w:sz w:val="20"/>
+          <w:szCs w:val="20"/>
+        </w:rPr>
+        <w:t/>
+      </w:r>
+      <w:r>
+        <w:rPr>
+          <w:rFonts w:ascii="Arial" w:hAnsi="Arial" w:cs="Tahoma"/>
+          <w:sz w:val="20"/>
+          <w:szCs w:val="20"/>
+        </w:rPr>
+        <w:t/>
+      </w:r>
+      <w:r>
+        <w:rPr>
+          <w:rFonts w:ascii="Arial" w:hAnsi="Arial" w:cs="Tahoma"/>
+          <w:sz w:val="20"/>
+          <w:szCs w:val="20"/>
+        </w:rPr>
+        <w:t/>
+      </w:r>
+      <w:r>
+        <w:rPr>
+          <w:rFonts w:ascii="Arial" w:hAnsi="Arial" w:cs="Tahoma"/>
+          <w:sz w:val="20"/>
+          <w:szCs w:val="20"/>
+        </w:rPr>
+        <w:t/>
+      </w:r>
+      <w:r>
+        <w:rPr>
+          <w:rFonts w:ascii="Arial" w:hAnsi="Arial" w:cs="Tahoma"/>
+          <w:sz w:val="20"/>
+          <w:szCs w:val="20"/>
+        </w:rPr>
+        <w:t/>
       </w:r>
     </w:p>
     <w:p>

</xml_diff>